<commit_message>
Oppdater portfolio med redesign
</commit_message>
<xml_diff>
--- a/assets/CV_Sander_Vinterhus_2026-kopi.docx
+++ b/assets/CV_Sander_Vinterhus_2026-kopi.docx
@@ -610,13 +610,7 @@
         <w:rPr>
           <w:lang w:val="nb-NO"/>
         </w:rPr>
-        <w:t xml:space="preserve">, </w:t>
-      </w:r>
-      <w:r>
-        <w:rPr>
-          <w:lang w:val="nb-NO"/>
-        </w:rPr>
-        <w:t xml:space="preserve">Adobe </w:t>
+        <w:t xml:space="preserve">, Adobe </w:t>
       </w:r>
       <w:proofErr w:type="spellStart"/>
       <w:r>

</xml_diff>